<commit_message>
Approvals and updates to report added
</commit_message>
<xml_diff>
--- a/Report/Final_Report.docx
+++ b/Report/Final_Report.docx
@@ -12066,21 +12066,7 @@
         <w:rPr>
           <w:szCs w:val="24"/>
         </w:rPr>
-        <w:t xml:space="preserve">, generated forecasts for </w:t>
-      </w:r>
-      <w:proofErr w:type="gramStart"/>
-      <w:r>
-        <w:rPr>
-          <w:szCs w:val="24"/>
-        </w:rPr>
-        <w:t>115 time</w:t>
-      </w:r>
-      <w:proofErr w:type="gramEnd"/>
-      <w:r>
-        <w:rPr>
-          <w:szCs w:val="24"/>
-        </w:rPr>
-        <w:t xml:space="preserve"> steps, offering projections spanning five years in 16-day increments without needing to retrain repeatedly.</w:t>
+        <w:t>, generated forecasts for 115 time steps, offering projections spanning five years in 16-day increments without needing to retrain repeatedly.</w:t>
       </w:r>
     </w:p>
     <w:p>
@@ -12449,16 +12435,8 @@
         <w:rPr>
           <w:szCs w:val="24"/>
         </w:rPr>
-        <w:t xml:space="preserve">presents </w:t>
-      </w:r>
-      <w:proofErr w:type="gramStart"/>
-      <w:r>
-        <w:rPr>
-          <w:szCs w:val="24"/>
-        </w:rPr>
-        <w:t>results</w:t>
-      </w:r>
-      <w:proofErr w:type="gramEnd"/>
+        <w:t>presents results</w:t>
+      </w:r>
       <w:r>
         <w:rPr>
           <w:szCs w:val="24"/>
@@ -13225,6 +13203,7 @@
       </w:pPr>
       <w:r>
         <w:rPr>
+          <w:noProof/>
           <w:szCs w:val="24"/>
         </w:rPr>
         <w:lastRenderedPageBreak/>
@@ -13585,6 +13564,7 @@
       </w:r>
       <w:r>
         <w:rPr>
+          <w:noProof/>
           <w:szCs w:val="24"/>
         </w:rPr>
         <w:drawing>
@@ -16576,19 +16556,7 @@
       </w:r>
       <w:proofErr w:type="spellEnd"/>
       <w:r>
-        <w:t xml:space="preserve"> ideal growing conditions</w:t>
-      </w:r>
-      <w:r>
-        <w:t xml:space="preserve"> at </w:t>
-      </w:r>
-      <w:r>
-        <w:t>a 16-day rainfall range of 11 to 26 mm combined with land surface temperatures between 31 and 40 degrees Celsius</w:t>
-      </w:r>
-      <w:r>
-        <w:t xml:space="preserve"> </w:t>
-      </w:r>
-      <w:r>
-        <w:t xml:space="preserve">closely match Malawi’s expected warm and dry climate. The fact that Millet, along with Sorghum and Cassava, outperforms traditional staples like Maize and Rice offers concrete, district-level evidence in favor of crop </w:t>
+        <w:t xml:space="preserve"> ideal growing conditions at a 16-day rainfall range of 11 to 26 mm combined with land surface temperatures between 31 and 40 degrees Celsius closely match Malawi’s expected warm and dry climate. The fact that Millet, along with Sorghum and Cassava, outperforms traditional staples like Maize and Rice offers concrete, district-level evidence in favor of crop </w:t>
       </w:r>
       <w:r>
         <w:lastRenderedPageBreak/>
@@ -20346,6 +20314,7 @@
     <w:p/>
     <w:p/>
     <w:p/>
+    <w:p/>
     <w:p>
       <w:pPr>
         <w:pStyle w:val="Caption"/>
@@ -20368,6 +20337,7 @@
           <w:sz w:val="24"/>
           <w:szCs w:val="24"/>
         </w:rPr>
+        <w:lastRenderedPageBreak/>
         <w:t xml:space="preserve">Table </w:t>
       </w:r>
       <w:r>
@@ -20498,7 +20468,6 @@
               <w:spacing w:after="0" w:line="240" w:lineRule="auto"/>
             </w:pPr>
             <w:r>
-              <w:lastRenderedPageBreak/>
               <w:t>ï»¿"NAME_0"</w:t>
             </w:r>
           </w:p>
@@ -22313,6 +22282,7 @@
           <w:sz w:val="24"/>
           <w:szCs w:val="24"/>
         </w:rPr>
+        <w:lastRenderedPageBreak/>
         <w:t xml:space="preserve">Table </w:t>
       </w:r>
       <w:r>
@@ -22442,7 +22412,6 @@
               <w:spacing w:after="0" w:line="240" w:lineRule="auto"/>
             </w:pPr>
             <w:r>
-              <w:lastRenderedPageBreak/>
               <w:t>NAME_0</w:t>
             </w:r>
           </w:p>
@@ -23980,8 +23949,6 @@
       <w:pPr>
         <w:pStyle w:val="Heading2"/>
         <w:rPr>
-          <w:b/>
-          <w:bCs/>
           <w:color w:val="auto"/>
         </w:rPr>
       </w:pPr>
@@ -23989,11 +23956,22 @@
       <w:bookmarkStart w:id="118" w:name="_Toc226214475"/>
       <w:r>
         <w:rPr>
-          <w:b/>
-          <w:bCs/>
           <w:color w:val="auto"/>
         </w:rPr>
-        <w:t>Appendix 3: Ethics Form</w:t>
+        <w:lastRenderedPageBreak/>
+        <w:t xml:space="preserve">Appendix </w:t>
+      </w:r>
+      <w:r>
+        <w:rPr>
+          <w:color w:val="auto"/>
+        </w:rPr>
+        <w:t>C</w:t>
+      </w:r>
+      <w:r>
+        <w:rPr>
+          <w:color w:val="auto"/>
+        </w:rPr>
+        <w:t>: Ethics Form</w:t>
       </w:r>
       <w:bookmarkEnd w:id="117"/>
       <w:bookmarkEnd w:id="118"/>
@@ -24006,23 +23984,115 @@
         <w:t xml:space="preserve"> </w:t>
       </w:r>
       <w:r>
-        <w:t xml:space="preserve">data from the African Agricultural Watch (AAGWA) platform. No human subjects were involved in data collection. The study poses no ethical risks </w:t>
-      </w:r>
+        <w:t>data from the African Agricultural Watch (AAGWA) platform. No human subjects were involved in data collection. The study poses no ethical risks related to privacy, consent, or data misuse. All outputs are aggregated at the district level, and no personally identifiable information is processed, stored, or displayed. The system is designed to support</w:t>
+      </w:r>
+      <w:r>
+        <w:t xml:space="preserve">, </w:t>
+      </w:r>
+      <w:r>
+        <w:t>not replace</w:t>
+      </w:r>
+      <w:r>
+        <w:t xml:space="preserve"> </w:t>
+      </w:r>
+      <w:r>
+        <w:t>local knowledge and agricultural extension services.</w:t>
+      </w:r>
+      <w:r>
+        <w:br/>
+      </w:r>
+    </w:p>
+    <w:p>
+      <w:pPr>
+        <w:pStyle w:val="Heading2"/>
+      </w:pPr>
+      <w:r>
+        <w:t xml:space="preserve">Appendix </w:t>
+      </w:r>
+      <w:r>
+        <w:t>D</w:t>
+      </w:r>
+      <w:r>
+        <w:t>: IRB Ethical Approval</w:t>
+      </w:r>
+    </w:p>
+    <w:p>
+      <w:r>
+        <w:t xml:space="preserve">This research was reviewed and approved by the Institutional Scientific and Ethics Review Committee (ISERC) at United States International University-Africa. The approval was granted on 2nd February 2026 under reference number USIU-A/ISERC/US1300-2026, covering the period from 2nd February 2026 to 2nd February 2027. The approval confirms that the study titled "Crop Prediction Using Climate Forecasting" met all institutional ethical requirements. The signed approval letter from ISERC, issued by Juliana M. </w:t>
+      </w:r>
+      <w:proofErr w:type="spellStart"/>
+      <w:r>
+        <w:t>Namada</w:t>
+      </w:r>
+      <w:proofErr w:type="spellEnd"/>
+      <w:r>
+        <w:t>, Ph.D., Institutional Ethics Review, is attached below.</w:t>
+      </w:r>
+    </w:p>
+    <w:p>
+      <w:pPr>
+        <w:ind w:left="0" w:firstLine="0"/>
+        <w:rPr>
+          <w:i/>
+          <w:iCs/>
+        </w:rPr>
+      </w:pPr>
+    </w:p>
+    <w:p>
+      <w:pPr>
+        <w:pStyle w:val="Heading2"/>
+      </w:pPr>
+      <w:r>
+        <w:t xml:space="preserve">Appendix </w:t>
+      </w:r>
+      <w:r>
+        <w:t>E</w:t>
+      </w:r>
+      <w:r>
+        <w:t>: NACOSTI Research License</w:t>
+      </w:r>
+    </w:p>
+    <w:p>
+      <w:r>
+        <w:t>Prior to commencing this study, a research permit application was submitted to the National Commission for Science, Technology and Innovation (NACOSTI) as required by ISERC. The application was supported by an introductory letter from USIU-Africa dated 2nd February 2026, signed by Prof. Amos Njuguna, DVC – Transformative Teaching, Learning and Research. The NACOSTI license is currently pending approval.</w:t>
+      </w:r>
+    </w:p>
+    <w:p/>
+    <w:p>
+      <w:pPr>
+        <w:pStyle w:val="Heading2"/>
+      </w:pPr>
+      <w:r>
+        <w:t>Appendix 6: Project GitHub Repository</w:t>
+      </w:r>
+    </w:p>
+    <w:p>
+      <w:r>
+        <w:t>The full source code for the Malawi Climate-Informed Crop Prediction System, including all Python modules, Flask application files, and the pipeline walkthrough notebook, is publicly available at the following repository:</w:t>
+      </w:r>
+    </w:p>
+    <w:p>
+      <w:hyperlink r:id="rId31" w:history="1">
+        <w:r>
+          <w:rPr>
+            <w:rStyle w:val="Hyperlink"/>
+          </w:rPr>
+          <w:t>https://github.com/QazGeo/Crop_Prediction_System_With_Time_Series</w:t>
+        </w:r>
+      </w:hyperlink>
+    </w:p>
+    <w:p>
       <w:r>
         <w:lastRenderedPageBreak/>
-        <w:t>related to privacy, consent, or data misuse. All outputs are aggregated at the district level, and no personally identifiable information is processed, stored, or displayed. The system is designed to support</w:t>
-      </w:r>
-      <w:r>
-        <w:t xml:space="preserve">, </w:t>
-      </w:r>
-      <w:r>
-        <w:t>not replace</w:t>
-      </w:r>
-      <w:r>
-        <w:t xml:space="preserve"> </w:t>
-      </w:r>
-      <w:r>
-        <w:t>local knowledge and agricultural extension services.</w:t>
+        <w:t xml:space="preserve">The repository contains models.py (crop suitability profiles and scoring functions), services.py (data loading, SARIMAX forecasting, and PDF generation), app.py (Flask web routes), and </w:t>
+      </w:r>
+      <w:proofErr w:type="spellStart"/>
+      <w:r>
+        <w:t>malawi_pipeline_walkthrough.ipynb</w:t>
+      </w:r>
+      <w:proofErr w:type="spellEnd"/>
+      <w:r>
+        <w:t xml:space="preserve"> (step-by-step pipeline demonstration notebook).</w:t>
       </w:r>
     </w:p>
     <w:p>
@@ -24170,7 +24240,7 @@
                     <pic:cNvPicPr/>
                   </pic:nvPicPr>
                   <pic:blipFill>
-                    <a:blip r:embed="rId31"/>
+                    <a:blip r:embed="rId32"/>
                     <a:stretch>
                       <a:fillRect/>
                     </a:stretch>
@@ -24260,7 +24330,7 @@
       </w:pPr>
     </w:p>
     <w:sectPr>
-      <w:headerReference w:type="default" r:id="rId32"/>
+      <w:headerReference w:type="default" r:id="rId33"/>
       <w:pgSz w:w="12240" w:h="15840"/>
       <w:pgMar w:top="1440" w:right="1440" w:bottom="1440" w:left="1440" w:header="720" w:footer="720" w:gutter="0"/>
       <w:pgNumType w:start="1"/>

</xml_diff>

<commit_message>
Fixed error referencing in both reports
</commit_message>
<xml_diff>
--- a/Report/Final_Report.docx
+++ b/Report/Final_Report.docx
@@ -335,8 +335,8 @@
           <w:szCs w:val="24"/>
         </w:rPr>
       </w:pPr>
-      <w:bookmarkStart w:id="1" w:name="_Toc29368"/>
-      <w:bookmarkStart w:id="2" w:name="_Toc227658558"/>
+      <w:bookmarkStart w:id="1" w:name="_Toc227658558"/>
+      <w:bookmarkStart w:id="2" w:name="_Toc29368"/>
       <w:bookmarkEnd w:id="0"/>
       <w:r>
         <w:rPr>
@@ -347,7 +347,7 @@
         <w:lastRenderedPageBreak/>
         <w:t>STUDENT’S DECLARATION</w:t>
       </w:r>
-      <w:bookmarkEnd w:id="2"/>
+      <w:bookmarkEnd w:id="1"/>
     </w:p>
     <w:p>
       <w:pPr>
@@ -1175,7 +1175,7 @@
         <w:lastRenderedPageBreak/>
         <w:t>DEDICATION</w:t>
       </w:r>
-      <w:bookmarkEnd w:id="1"/>
+      <w:bookmarkEnd w:id="2"/>
       <w:bookmarkEnd w:id="6"/>
     </w:p>
     <w:p>
@@ -9051,7 +9051,7 @@
           <w:tab w:val="right" w:leader="dot" w:pos="9350"/>
         </w:tabs>
         <w:spacing w:line="480" w:lineRule="auto"/>
-        <w:ind w:left="960" w:hanging="480"/>
+        <w:ind w:left="920" w:hanging="440"/>
         <w:jc w:val="both"/>
         <w:rPr>
           <w:rFonts w:ascii="Times New Roman" w:eastAsiaTheme="minorEastAsia" w:hAnsi="Times New Roman"/>
@@ -9150,7 +9150,7 @@
           <w:tab w:val="right" w:leader="dot" w:pos="9350"/>
         </w:tabs>
         <w:spacing w:line="480" w:lineRule="auto"/>
-        <w:ind w:left="960" w:hanging="480"/>
+        <w:ind w:left="920" w:hanging="440"/>
         <w:jc w:val="both"/>
         <w:rPr>
           <w:rFonts w:ascii="Times New Roman" w:eastAsiaTheme="minorEastAsia" w:hAnsi="Times New Roman"/>
@@ -9249,7 +9249,7 @@
           <w:tab w:val="right" w:leader="dot" w:pos="9350"/>
         </w:tabs>
         <w:spacing w:line="480" w:lineRule="auto"/>
-        <w:ind w:left="960" w:hanging="480"/>
+        <w:ind w:left="920" w:hanging="440"/>
         <w:jc w:val="both"/>
         <w:rPr>
           <w:rFonts w:ascii="Times New Roman" w:eastAsiaTheme="minorEastAsia" w:hAnsi="Times New Roman"/>
@@ -9348,7 +9348,7 @@
           <w:tab w:val="right" w:leader="dot" w:pos="9350"/>
         </w:tabs>
         <w:spacing w:line="480" w:lineRule="auto"/>
-        <w:ind w:left="960" w:hanging="480"/>
+        <w:ind w:left="920" w:hanging="440"/>
         <w:jc w:val="both"/>
         <w:rPr>
           <w:rFonts w:ascii="Times New Roman" w:eastAsiaTheme="minorEastAsia" w:hAnsi="Times New Roman"/>
@@ -9447,7 +9447,7 @@
           <w:tab w:val="right" w:leader="dot" w:pos="9350"/>
         </w:tabs>
         <w:spacing w:line="480" w:lineRule="auto"/>
-        <w:ind w:left="960" w:hanging="480"/>
+        <w:ind w:left="920" w:hanging="440"/>
         <w:jc w:val="both"/>
         <w:rPr>
           <w:rFonts w:ascii="Times New Roman" w:eastAsiaTheme="minorEastAsia" w:hAnsi="Times New Roman"/>
@@ -9725,7 +9725,7 @@
           <w:tab w:val="right" w:leader="dot" w:pos="9350"/>
         </w:tabs>
         <w:spacing w:line="480" w:lineRule="auto"/>
-        <w:ind w:left="960" w:hanging="480"/>
+        <w:ind w:left="920" w:hanging="440"/>
         <w:jc w:val="both"/>
         <w:rPr>
           <w:rFonts w:ascii="Times New Roman" w:eastAsiaTheme="minorEastAsia" w:hAnsi="Times New Roman"/>
@@ -9824,7 +9824,7 @@
           <w:tab w:val="right" w:leader="dot" w:pos="9350"/>
         </w:tabs>
         <w:spacing w:line="480" w:lineRule="auto"/>
-        <w:ind w:left="960" w:hanging="480"/>
+        <w:ind w:left="920" w:hanging="440"/>
         <w:jc w:val="both"/>
         <w:rPr>
           <w:rFonts w:ascii="Times New Roman" w:eastAsiaTheme="minorEastAsia" w:hAnsi="Times New Roman"/>
@@ -9923,7 +9923,7 @@
           <w:tab w:val="right" w:leader="dot" w:pos="9350"/>
         </w:tabs>
         <w:spacing w:line="480" w:lineRule="auto"/>
-        <w:ind w:left="960" w:hanging="480"/>
+        <w:ind w:left="920" w:hanging="440"/>
         <w:jc w:val="both"/>
         <w:rPr>
           <w:rFonts w:ascii="Times New Roman" w:eastAsiaTheme="minorEastAsia" w:hAnsi="Times New Roman"/>
@@ -10022,7 +10022,7 @@
           <w:tab w:val="right" w:leader="dot" w:pos="9350"/>
         </w:tabs>
         <w:spacing w:line="480" w:lineRule="auto"/>
-        <w:ind w:left="960" w:hanging="480"/>
+        <w:ind w:left="920" w:hanging="440"/>
         <w:jc w:val="both"/>
         <w:rPr>
           <w:rFonts w:ascii="Times New Roman" w:eastAsiaTheme="minorEastAsia" w:hAnsi="Times New Roman"/>
@@ -10121,7 +10121,7 @@
           <w:tab w:val="right" w:leader="dot" w:pos="9350"/>
         </w:tabs>
         <w:spacing w:line="480" w:lineRule="auto"/>
-        <w:ind w:left="960" w:hanging="480"/>
+        <w:ind w:left="920" w:hanging="440"/>
         <w:jc w:val="both"/>
         <w:rPr>
           <w:rFonts w:ascii="Times New Roman" w:eastAsiaTheme="minorEastAsia" w:hAnsi="Times New Roman"/>
@@ -10220,7 +10220,7 @@
           <w:tab w:val="right" w:leader="dot" w:pos="9350"/>
         </w:tabs>
         <w:spacing w:line="480" w:lineRule="auto"/>
-        <w:ind w:left="960" w:hanging="480"/>
+        <w:ind w:left="920" w:hanging="440"/>
         <w:jc w:val="both"/>
         <w:rPr>
           <w:rFonts w:ascii="Times New Roman" w:eastAsiaTheme="minorEastAsia" w:hAnsi="Times New Roman"/>
@@ -14333,7 +14333,6 @@
         <w:t xml:space="preserve"> notebooks, resulting in one clean CSV file used by the Flask app. Four steps were followed. First, a row-skipping function found and removed HTML rows by locating the first valid header and dropping everything before it. Second, </w:t>
       </w:r>
       <w:proofErr w:type="spellStart"/>
-      <w:proofErr w:type="gramStart"/>
       <w:r>
         <w:rPr>
           <w:szCs w:val="24"/>
@@ -14341,7 +14340,6 @@
         <w:t>pandas.melt</w:t>
       </w:r>
       <w:proofErr w:type="spellEnd"/>
-      <w:proofErr w:type="gramEnd"/>
       <w:r>
         <w:rPr>
           <w:szCs w:val="24"/>
@@ -14456,21 +14454,7 @@
         <w:rPr>
           <w:szCs w:val="24"/>
         </w:rPr>
-        <w:t xml:space="preserve">, generated forecasts for </w:t>
-      </w:r>
-      <w:proofErr w:type="gramStart"/>
-      <w:r>
-        <w:rPr>
-          <w:szCs w:val="24"/>
-        </w:rPr>
-        <w:t>115 time</w:t>
-      </w:r>
-      <w:proofErr w:type="gramEnd"/>
-      <w:r>
-        <w:rPr>
-          <w:szCs w:val="24"/>
-        </w:rPr>
-        <w:t xml:space="preserve"> steps, offering projections spanning five years in 16-day increments without needing to retrain repeatedly.</w:t>
+        <w:t>, generated forecasts for 115 time steps, offering projections spanning five years in 16-day increments without needing to retrain repeatedly.</w:t>
       </w:r>
     </w:p>
     <w:p>
@@ -14823,16 +14807,8 @@
         <w:rPr>
           <w:szCs w:val="24"/>
         </w:rPr>
-        <w:t xml:space="preserve">presents </w:t>
-      </w:r>
-      <w:proofErr w:type="gramStart"/>
-      <w:r>
-        <w:rPr>
-          <w:szCs w:val="24"/>
-        </w:rPr>
-        <w:t>results</w:t>
-      </w:r>
-      <w:proofErr w:type="gramEnd"/>
+        <w:t>presents results</w:t>
+      </w:r>
       <w:r>
         <w:rPr>
           <w:szCs w:val="24"/>
@@ -19608,9 +19584,6 @@
       <w:pPr>
         <w:spacing w:after="160" w:line="480" w:lineRule="auto"/>
         <w:ind w:left="0" w:firstLine="0"/>
-        <w:rPr>
-          <w:bCs/>
-        </w:rPr>
       </w:pPr>
       <w:proofErr w:type="spellStart"/>
       <w:r>
@@ -19662,7 +19635,7 @@
         <w:rPr>
           <w:bCs/>
         </w:rPr>
-        <w:t xml:space="preserve">Food and Agriculture Organization. (2023). </w:t>
+        <w:t xml:space="preserve">Food and Agriculture Organization. (2021). </w:t>
       </w:r>
       <w:r>
         <w:rPr>
@@ -19670,6 +19643,44 @@
           <w:i/>
           <w:iCs/>
         </w:rPr>
+        <w:t>The state of food and agriculture 2021: Making agrifood systems more resilient to shocks and stresses</w:t>
+      </w:r>
+      <w:r>
+        <w:rPr>
+          <w:bCs/>
+        </w:rPr>
+        <w:t xml:space="preserve">. FAO. </w:t>
+      </w:r>
+      <w:hyperlink r:id="rId22" w:history="1">
+        <w:r>
+          <w:rPr>
+            <w:rStyle w:val="Hyperlink"/>
+            <w:bCs/>
+          </w:rPr>
+          <w:t>https://doi.org/10.4060/cb4476en</w:t>
+        </w:r>
+      </w:hyperlink>
+    </w:p>
+    <w:p>
+      <w:pPr>
+        <w:spacing w:after="160" w:line="480" w:lineRule="auto"/>
+        <w:ind w:left="0" w:firstLine="0"/>
+        <w:rPr>
+          <w:bCs/>
+        </w:rPr>
+      </w:pPr>
+      <w:r>
+        <w:rPr>
+          <w:bCs/>
+        </w:rPr>
+        <w:t xml:space="preserve">Food and Agriculture Organization. (2023). </w:t>
+      </w:r>
+      <w:r>
+        <w:rPr>
+          <w:bCs/>
+          <w:i/>
+          <w:iCs/>
+        </w:rPr>
         <w:t>2023 food systems profile: Malawi</w:t>
       </w:r>
       <w:r>
@@ -19678,7 +19689,7 @@
         </w:rPr>
         <w:t xml:space="preserve">. FAO, European Union &amp; CIRAD. </w:t>
       </w:r>
-      <w:hyperlink r:id="rId22" w:history="1">
+      <w:hyperlink r:id="rId23" w:history="1">
         <w:r>
           <w:rPr>
             <w:rStyle w:val="Hyperlink"/>
@@ -19716,7 +19727,7 @@
         </w:rPr>
         <w:t xml:space="preserve">. Springer. </w:t>
       </w:r>
-      <w:hyperlink r:id="rId23" w:history="1">
+      <w:hyperlink r:id="rId24" w:history="1">
         <w:r>
           <w:rPr>
             <w:rStyle w:val="Hyperlink"/>
@@ -19768,51 +19779,13 @@
         </w:rPr>
         <w:t xml:space="preserve">. </w:t>
       </w:r>
-      <w:hyperlink r:id="rId24" w:history="1">
+      <w:hyperlink r:id="rId25" w:history="1">
         <w:r>
           <w:rPr>
             <w:rStyle w:val="Hyperlink"/>
             <w:bCs/>
           </w:rPr>
           <w:t>https://otexts.com/fpp2/</w:t>
-        </w:r>
-      </w:hyperlink>
-    </w:p>
-    <w:p>
-      <w:pPr>
-        <w:spacing w:after="160" w:line="480" w:lineRule="auto"/>
-        <w:ind w:left="0" w:firstLine="0"/>
-        <w:rPr>
-          <w:bCs/>
-        </w:rPr>
-      </w:pPr>
-      <w:r>
-        <w:rPr>
-          <w:bCs/>
-        </w:rPr>
-        <w:t xml:space="preserve">Intergovernmental Panel on Climate Change. (2022). </w:t>
-      </w:r>
-      <w:r>
-        <w:rPr>
-          <w:bCs/>
-          <w:i/>
-          <w:iCs/>
-        </w:rPr>
-        <w:t>Climate change 2022: Impacts, adaptation and vulnerability</w:t>
-      </w:r>
-      <w:r>
-        <w:rPr>
-          <w:bCs/>
-        </w:rPr>
-        <w:t xml:space="preserve">. Cambridge University Press. </w:t>
-      </w:r>
-      <w:hyperlink r:id="rId25" w:history="1">
-        <w:r>
-          <w:rPr>
-            <w:rStyle w:val="Hyperlink"/>
-            <w:bCs/>
-          </w:rPr>
-          <w:t>https://www.ipcc.ch/report/ar6/wg2/</w:t>
         </w:r>
       </w:hyperlink>
     </w:p>
@@ -26926,14 +26899,9 @@
       </w:r>
       <w:proofErr w:type="spellStart"/>
       <w:r>
-        <w:t>malawi_pipeline_</w:t>
-      </w:r>
-      <w:proofErr w:type="gramStart"/>
-      <w:r>
-        <w:t>walkthrough.ipynb</w:t>
+        <w:t>malawi_pipeline_walkthrough.ipynb</w:t>
       </w:r>
       <w:proofErr w:type="spellEnd"/>
-      <w:proofErr w:type="gramEnd"/>
       <w:r>
         <w:t xml:space="preserve"> (step-by-step pipeline demonstration notebook).</w:t>
       </w:r>

</xml_diff>

<commit_message>
Made changes to reports
</commit_message>
<xml_diff>
--- a/Report/Final_Report.docx
+++ b/Report/Final_Report.docx
@@ -19451,7 +19451,7 @@
         <w:rPr>
           <w:szCs w:val="24"/>
         </w:rPr>
-        <w:t>AI tools were used in the development of this project in the following capacities. Claude (Anthropic) was used during the coding phase to assist with debugging, code structure review, and refactoring across the Flask application modules. Specifically, it was consulted when resolving issues in app.py, services.py, and models.py, and when iterating on the SARIMAX forecasting logic and trapezoidal suitability scoring functions. AI assistance was also used during the write-up phase to review and improve the clarity of sections of this report.</w:t>
+        <w:t xml:space="preserve">AI tools were used in the development of this project in the following capacities. Claude (Anthropic) was used during the coding phase to assist with debugging, code structure review, and refactoring across the Flask application modules. Specifically, it was consulted when resolving issues in app.py, services.py, and models.py, and when iterating on the SARIMAX forecasting logic and trapezoidal suitability scoring functions. </w:t>
       </w:r>
     </w:p>
     <w:p>
@@ -19459,15 +19459,33 @@
         <w:spacing w:after="160" w:line="480" w:lineRule="auto"/>
         <w:ind w:left="0" w:firstLine="0"/>
         <w:rPr>
-          <w:bCs/>
-        </w:rPr>
-      </w:pPr>
-      <w:r>
-        <w:rPr>
-          <w:szCs w:val="24"/>
-        </w:rPr>
-        <w:t>All research questions, design decisions, methodology choices, data sourcing, model configuration, result interpretation, and conclusions are the author's own. No AI tool was used to generate references, fabricate data, or produce results. All references cited in this report are real, independently verified, and correctly attributed.</w:t>
-      </w:r>
+          <w:szCs w:val="24"/>
+        </w:rPr>
+      </w:pPr>
+      <w:r>
+        <w:rPr>
+          <w:szCs w:val="24"/>
+        </w:rPr>
+        <w:t xml:space="preserve">All research questions, design decisions, methodology choices, data sourcing, model configuration, result interpretation, and conclusions are the author's own. </w:t>
+      </w:r>
+    </w:p>
+    <w:p>
+      <w:pPr>
+        <w:spacing w:after="160" w:line="480" w:lineRule="auto"/>
+        <w:ind w:left="0" w:firstLine="0"/>
+        <w:rPr>
+          <w:szCs w:val="24"/>
+        </w:rPr>
+      </w:pPr>
+    </w:p>
+    <w:p>
+      <w:pPr>
+        <w:spacing w:after="160" w:line="480" w:lineRule="auto"/>
+        <w:ind w:left="0" w:firstLine="0"/>
+        <w:rPr>
+          <w:bCs/>
+        </w:rPr>
+      </w:pPr>
     </w:p>
     <w:p>
       <w:pPr>
@@ -28928,6 +28946,7 @@
   <w:style w:type="character" w:default="1" w:styleId="DefaultParagraphFont">
     <w:name w:val="Default Paragraph Font"/>
     <w:uiPriority w:val="1"/>
+    <w:semiHidden/>
     <w:unhideWhenUsed/>
   </w:style>
   <w:style w:type="table" w:default="1" w:styleId="TableNormal">

</xml_diff>